<commit_message>
Added table of contents to report
</commit_message>
<xml_diff>
--- a/docs/final-report/docx/B37VB - Edinburgh - Robotics - Group 5 - Final Report.pdf.docx
+++ b/docs/final-report/docx/B37VB - Edinburgh - Robotics - Group 5 - Final Report.pdf.docx
@@ -3,29 +3,468 @@
 <w:document xmlns:wpc="http://schemas.microsoft.com/office/word/2010/wordprocessingCanvas" xmlns:cx="http://schemas.microsoft.com/office/drawing/2014/chartex" xmlns:cx1="http://schemas.microsoft.com/office/drawing/2015/9/8/chartex" xmlns:cx2="http://schemas.microsoft.com/office/drawing/2015/10/21/chartex" xmlns:cx3="http://schemas.microsoft.com/office/drawing/2016/5/9/chartex" xmlns:cx4="http://schemas.microsoft.com/office/drawing/2016/5/10/chartex" xmlns:cx5="http://schemas.microsoft.com/office/drawing/2016/5/11/chartex" xmlns:cx6="http://schemas.microsoft.com/office/drawing/2016/5/12/chartex" xmlns:cx7="http://schemas.microsoft.com/office/drawing/2016/5/13/chartex" xmlns:cx8="http://schemas.microsoft.com/office/drawing/2016/5/14/chartex" xmlns:mc="http://schemas.openxmlformats.org/markup-compatibility/2006" xmlns:aink="http://schemas.microsoft.com/office/drawing/2016/ink" xmlns:am3d="http://schemas.microsoft.com/office/drawing/2017/model3d" xmlns:o="urn:schemas-microsoft-com:office:office" xmlns:oel="http://schemas.microsoft.com/office/2019/extlst" xmlns:r="http://schemas.openxmlformats.org/officeDocument/2006/relationships" xmlns:m="http://schemas.openxmlformats.org/officeDocument/2006/math" xmlns:v="urn:schemas-microsoft-com:vml" xmlns:wp14="http://schemas.microsoft.com/office/word/2010/wordprocessingDrawing" xmlns:wp="http://schemas.openxmlformats.org/drawingml/2006/wordprocessingDrawing" xmlns:w10="urn:schemas-microsoft-com:office:word" xmlns:w="http://schemas.openxmlformats.org/wordprocessingml/2006/main" xmlns:w14="http://schemas.microsoft.com/office/word/2010/wordml" xmlns:w15="http://schemas.microsoft.com/office/word/2012/wordml" xmlns:w16cex="http://schemas.microsoft.com/office/word/2018/wordml/cex" xmlns:w16cid="http://schemas.microsoft.com/office/word/2016/wordml/cid" xmlns:w16="http://schemas.microsoft.com/office/word/2018/wordml" xmlns:w16du="http://schemas.microsoft.com/office/word/2023/wordml/word16du" xmlns:w16sdtdh="http://schemas.microsoft.com/office/word/2020/wordml/sdtdatahash" xmlns:w16sdtfl="http://schemas.microsoft.com/office/word/2024/wordml/sdtformatlock" xmlns:w16se="http://schemas.microsoft.com/office/word/2015/wordml/symex" xmlns:wpg="http://schemas.microsoft.com/office/word/2010/wordprocessingGroup" xmlns:wpi="http://schemas.microsoft.com/office/word/2010/wordprocessingInk" xmlns:wne="http://schemas.microsoft.com/office/word/2006/wordml" xmlns:wps="http://schemas.microsoft.com/office/word/2010/wordprocessingShape" mc:Ignorable="w14 w15 w16se w16cid w16 w16cex w16sdtdh w16sdtfl w16du wp14">
   <w:body>
     <w:p>
+      <w:pPr>
+        <w:pStyle w:val="TOCHeading"/>
+      </w:pPr>
+    </w:p>
+    <w:sdt>
+      <w:sdtPr>
+        <w:id w:val="-1276251741"/>
+        <w:docPartObj>
+          <w:docPartGallery w:val="Table of Contents"/>
+          <w:docPartUnique/>
+        </w:docPartObj>
+      </w:sdtPr>
+      <w:sdtEndPr>
+        <w:rPr>
+          <w:rFonts w:asciiTheme="minorHAnsi" w:eastAsiaTheme="minorHAnsi" w:hAnsiTheme="minorHAnsi" w:cstheme="minorBidi"/>
+          <w:noProof/>
+          <w:color w:val="auto"/>
+          <w:kern w:val="2"/>
+          <w:sz w:val="22"/>
+          <w:szCs w:val="22"/>
+          <w:lang w:val="en-GB"/>
+          <w14:ligatures w14:val="standardContextual"/>
+        </w:rPr>
+      </w:sdtEndPr>
+      <w:sdtContent>
+        <w:p>
+          <w:pPr>
+            <w:pStyle w:val="TOCHeading"/>
+          </w:pPr>
+          <w:r>
+            <w:t>Table of Contents</w:t>
+          </w:r>
+        </w:p>
+        <w:p>
+          <w:pPr>
+            <w:pStyle w:val="TOC1"/>
+            <w:tabs>
+              <w:tab w:val="right" w:leader="dot" w:pos="9016"/>
+            </w:tabs>
+            <w:rPr>
+              <w:rFonts w:eastAsiaTheme="minorEastAsia"/>
+              <w:noProof/>
+              <w:sz w:val="24"/>
+              <w:szCs w:val="24"/>
+              <w:lang w:val="en-AE" w:eastAsia="en-AE"/>
+            </w:rPr>
+          </w:pPr>
+          <w:r>
+            <w:fldChar w:fldCharType="begin"/>
+          </w:r>
+          <w:r>
+            <w:instrText xml:space="preserve"> TOC \o "1-3" \h \z \u </w:instrText>
+          </w:r>
+          <w:r>
+            <w:fldChar w:fldCharType="separate"/>
+          </w:r>
+          <w:hyperlink w:anchor="_Toc224215070" w:history="1">
+            <w:r>
+              <w:rPr>
+                <w:rStyle w:val="Hyperlink"/>
+                <w:noProof/>
+              </w:rPr>
+              <w:t>Introduction</w:t>
+            </w:r>
+            <w:r>
+              <w:rPr>
+                <w:noProof/>
+                <w:webHidden/>
+              </w:rPr>
+              <w:tab/>
+            </w:r>
+            <w:r>
+              <w:rPr>
+                <w:noProof/>
+                <w:webHidden/>
+              </w:rPr>
+              <w:fldChar w:fldCharType="begin"/>
+            </w:r>
+            <w:r>
+              <w:rPr>
+                <w:noProof/>
+                <w:webHidden/>
+              </w:rPr>
+              <w:instrText xml:space="preserve"> PAGEREF _Toc224215070 \h </w:instrText>
+            </w:r>
+            <w:r>
+              <w:rPr>
+                <w:noProof/>
+                <w:webHidden/>
+              </w:rPr>
+            </w:r>
+            <w:r>
+              <w:rPr>
+                <w:noProof/>
+                <w:webHidden/>
+              </w:rPr>
+              <w:fldChar w:fldCharType="separate"/>
+            </w:r>
+            <w:r>
+              <w:rPr>
+                <w:noProof/>
+                <w:webHidden/>
+              </w:rPr>
+              <w:t>1</w:t>
+            </w:r>
+            <w:r>
+              <w:rPr>
+                <w:noProof/>
+                <w:webHidden/>
+              </w:rPr>
+              <w:fldChar w:fldCharType="end"/>
+            </w:r>
+          </w:hyperlink>
+        </w:p>
+        <w:p>
+          <w:pPr>
+            <w:pStyle w:val="TOC1"/>
+            <w:tabs>
+              <w:tab w:val="right" w:leader="dot" w:pos="9016"/>
+            </w:tabs>
+            <w:rPr>
+              <w:rFonts w:eastAsiaTheme="minorEastAsia"/>
+              <w:noProof/>
+              <w:sz w:val="24"/>
+              <w:szCs w:val="24"/>
+              <w:lang w:val="en-AE" w:eastAsia="en-AE"/>
+            </w:rPr>
+          </w:pPr>
+          <w:hyperlink w:anchor="_Toc224215071" w:history="1">
+            <w:r>
+              <w:rPr>
+                <w:rStyle w:val="Hyperlink"/>
+                <w:noProof/>
+              </w:rPr>
+              <w:t>Theory of operation</w:t>
+            </w:r>
+            <w:r>
+              <w:rPr>
+                <w:noProof/>
+                <w:webHidden/>
+              </w:rPr>
+              <w:tab/>
+            </w:r>
+            <w:r>
+              <w:rPr>
+                <w:noProof/>
+                <w:webHidden/>
+              </w:rPr>
+              <w:fldChar w:fldCharType="begin"/>
+            </w:r>
+            <w:r>
+              <w:rPr>
+                <w:noProof/>
+                <w:webHidden/>
+              </w:rPr>
+              <w:instrText xml:space="preserve"> PAGEREF _Toc224215071 \h </w:instrText>
+            </w:r>
+            <w:r>
+              <w:rPr>
+                <w:noProof/>
+                <w:webHidden/>
+              </w:rPr>
+            </w:r>
+            <w:r>
+              <w:rPr>
+                <w:noProof/>
+                <w:webHidden/>
+              </w:rPr>
+              <w:fldChar w:fldCharType="separate"/>
+            </w:r>
+            <w:r>
+              <w:rPr>
+                <w:noProof/>
+                <w:webHidden/>
+              </w:rPr>
+              <w:t>1</w:t>
+            </w:r>
+            <w:r>
+              <w:rPr>
+                <w:noProof/>
+                <w:webHidden/>
+              </w:rPr>
+              <w:fldChar w:fldCharType="end"/>
+            </w:r>
+          </w:hyperlink>
+        </w:p>
+        <w:p>
+          <w:pPr>
+            <w:pStyle w:val="TOC1"/>
+            <w:tabs>
+              <w:tab w:val="right" w:leader="dot" w:pos="9016"/>
+            </w:tabs>
+            <w:rPr>
+              <w:rFonts w:eastAsiaTheme="minorEastAsia"/>
+              <w:noProof/>
+              <w:sz w:val="24"/>
+              <w:szCs w:val="24"/>
+              <w:lang w:val="en-AE" w:eastAsia="en-AE"/>
+            </w:rPr>
+          </w:pPr>
+          <w:hyperlink w:anchor="_Toc224215072" w:history="1">
+            <w:r>
+              <w:rPr>
+                <w:rStyle w:val="Hyperlink"/>
+                <w:noProof/>
+              </w:rPr>
+              <w:t>Light-Tracking Algorithm</w:t>
+            </w:r>
+            <w:r>
+              <w:rPr>
+                <w:noProof/>
+                <w:webHidden/>
+              </w:rPr>
+              <w:tab/>
+            </w:r>
+            <w:r>
+              <w:rPr>
+                <w:noProof/>
+                <w:webHidden/>
+              </w:rPr>
+              <w:fldChar w:fldCharType="begin"/>
+            </w:r>
+            <w:r>
+              <w:rPr>
+                <w:noProof/>
+                <w:webHidden/>
+              </w:rPr>
+              <w:instrText xml:space="preserve"> PAGEREF _Toc224215072 \h </w:instrText>
+            </w:r>
+            <w:r>
+              <w:rPr>
+                <w:noProof/>
+                <w:webHidden/>
+              </w:rPr>
+            </w:r>
+            <w:r>
+              <w:rPr>
+                <w:noProof/>
+                <w:webHidden/>
+              </w:rPr>
+              <w:fldChar w:fldCharType="separate"/>
+            </w:r>
+            <w:r>
+              <w:rPr>
+                <w:noProof/>
+                <w:webHidden/>
+              </w:rPr>
+              <w:t>1</w:t>
+            </w:r>
+            <w:r>
+              <w:rPr>
+                <w:noProof/>
+                <w:webHidden/>
+              </w:rPr>
+              <w:fldChar w:fldCharType="end"/>
+            </w:r>
+          </w:hyperlink>
+        </w:p>
+        <w:p>
+          <w:pPr>
+            <w:pStyle w:val="TOC1"/>
+            <w:tabs>
+              <w:tab w:val="right" w:leader="dot" w:pos="9016"/>
+            </w:tabs>
+            <w:rPr>
+              <w:rFonts w:eastAsiaTheme="minorEastAsia"/>
+              <w:noProof/>
+              <w:sz w:val="24"/>
+              <w:szCs w:val="24"/>
+              <w:lang w:val="en-AE" w:eastAsia="en-AE"/>
+            </w:rPr>
+          </w:pPr>
+          <w:hyperlink w:anchor="_Toc224215073" w:history="1">
+            <w:r>
+              <w:rPr>
+                <w:rStyle w:val="Hyperlink"/>
+                <w:noProof/>
+              </w:rPr>
+              <w:t>Results</w:t>
+            </w:r>
+            <w:r>
+              <w:rPr>
+                <w:noProof/>
+                <w:webHidden/>
+              </w:rPr>
+              <w:tab/>
+            </w:r>
+            <w:r>
+              <w:rPr>
+                <w:noProof/>
+                <w:webHidden/>
+              </w:rPr>
+              <w:fldChar w:fldCharType="begin"/>
+            </w:r>
+            <w:r>
+              <w:rPr>
+                <w:noProof/>
+                <w:webHidden/>
+              </w:rPr>
+              <w:instrText xml:space="preserve"> PAGEREF _Toc224215073 \h </w:instrText>
+            </w:r>
+            <w:r>
+              <w:rPr>
+                <w:noProof/>
+                <w:webHidden/>
+              </w:rPr>
+            </w:r>
+            <w:r>
+              <w:rPr>
+                <w:noProof/>
+                <w:webHidden/>
+              </w:rPr>
+              <w:fldChar w:fldCharType="separate"/>
+            </w:r>
+            <w:r>
+              <w:rPr>
+                <w:noProof/>
+                <w:webHidden/>
+              </w:rPr>
+              <w:t>1</w:t>
+            </w:r>
+            <w:r>
+              <w:rPr>
+                <w:noProof/>
+                <w:webHidden/>
+              </w:rPr>
+              <w:fldChar w:fldCharType="end"/>
+            </w:r>
+          </w:hyperlink>
+        </w:p>
+        <w:p>
+          <w:pPr>
+            <w:pStyle w:val="TOC1"/>
+            <w:tabs>
+              <w:tab w:val="right" w:leader="dot" w:pos="9016"/>
+            </w:tabs>
+            <w:rPr>
+              <w:rFonts w:eastAsiaTheme="minorEastAsia"/>
+              <w:noProof/>
+              <w:sz w:val="24"/>
+              <w:szCs w:val="24"/>
+              <w:lang w:val="en-AE" w:eastAsia="en-AE"/>
+            </w:rPr>
+          </w:pPr>
+          <w:hyperlink w:anchor="_Toc224215074" w:history="1">
+            <w:r>
+              <w:rPr>
+                <w:rStyle w:val="Hyperlink"/>
+                <w:noProof/>
+              </w:rPr>
+              <w:t>Conclusion</w:t>
+            </w:r>
+            <w:r>
+              <w:rPr>
+                <w:noProof/>
+                <w:webHidden/>
+              </w:rPr>
+              <w:tab/>
+            </w:r>
+            <w:r>
+              <w:rPr>
+                <w:noProof/>
+                <w:webHidden/>
+              </w:rPr>
+              <w:fldChar w:fldCharType="begin"/>
+            </w:r>
+            <w:r>
+              <w:rPr>
+                <w:noProof/>
+                <w:webHidden/>
+              </w:rPr>
+              <w:instrText xml:space="preserve"> PAGEREF _Toc224215074 \h </w:instrText>
+            </w:r>
+            <w:r>
+              <w:rPr>
+                <w:noProof/>
+                <w:webHidden/>
+              </w:rPr>
+            </w:r>
+            <w:r>
+              <w:rPr>
+                <w:noProof/>
+                <w:webHidden/>
+              </w:rPr>
+              <w:fldChar w:fldCharType="separate"/>
+            </w:r>
+            <w:r>
+              <w:rPr>
+                <w:noProof/>
+                <w:webHidden/>
+              </w:rPr>
+              <w:t>1</w:t>
+            </w:r>
+            <w:r>
+              <w:rPr>
+                <w:noProof/>
+                <w:webHidden/>
+              </w:rPr>
+              <w:fldChar w:fldCharType="end"/>
+            </w:r>
+          </w:hyperlink>
+        </w:p>
+        <w:p>
+          <w:r>
+            <w:rPr>
+              <w:noProof/>
+            </w:rPr>
+            <w:fldChar w:fldCharType="end"/>
+          </w:r>
+        </w:p>
+      </w:sdtContent>
+    </w:sdt>
+    <w:p/>
+    <w:p>
+      <w:pPr>
+        <w:pStyle w:val="Heading1"/>
+      </w:pPr>
+      <w:bookmarkStart w:id="0" w:name="_Toc224215070"/>
       <w:r>
         <w:t>Introduction</w:t>
       </w:r>
+      <w:bookmarkEnd w:id="0"/>
     </w:p>
     <w:p>
+      <w:pPr>
+        <w:pStyle w:val="Heading1"/>
+      </w:pPr>
+      <w:bookmarkStart w:id="1" w:name="_Toc224215071"/>
       <w:r>
         <w:t>Theory of operation</w:t>
       </w:r>
+      <w:bookmarkEnd w:id="1"/>
     </w:p>
     <w:p>
+      <w:pPr>
+        <w:pStyle w:val="Heading1"/>
+      </w:pPr>
+      <w:bookmarkStart w:id="2" w:name="_Toc224215072"/>
       <w:r>
         <w:t>Light-Tracking Algorithm</w:t>
       </w:r>
+      <w:bookmarkEnd w:id="2"/>
     </w:p>
     <w:p>
+      <w:pPr>
+        <w:pStyle w:val="Heading1"/>
+      </w:pPr>
+      <w:bookmarkStart w:id="3" w:name="_Toc224215073"/>
       <w:r>
         <w:t>Results</w:t>
       </w:r>
+      <w:bookmarkEnd w:id="3"/>
     </w:p>
     <w:p>
+      <w:pPr>
+        <w:pStyle w:val="Heading1"/>
+      </w:pPr>
+      <w:bookmarkStart w:id="4" w:name="_Toc224215074"/>
       <w:r>
         <w:t>Conclusion</w:t>
       </w:r>
+      <w:bookmarkEnd w:id="4"/>
     </w:p>
     <w:sectPr>
       <w:pgSz w:w="11906" w:h="16838"/>
@@ -35,6 +474,153 @@
     </w:sectPr>
   </w:body>
 </w:document>
+</file>
+
+<file path=word/endnotes.xml><?xml version="1.0" encoding="utf-8"?>
+<w:endnotes xmlns:wpc="http://schemas.microsoft.com/office/word/2010/wordprocessingCanvas" xmlns:cx="http://schemas.microsoft.com/office/drawing/2014/chartex" xmlns:cx1="http://schemas.microsoft.com/office/drawing/2015/9/8/chartex" xmlns:cx2="http://schemas.microsoft.com/office/drawing/2015/10/21/chartex" xmlns:cx3="http://schemas.microsoft.com/office/drawing/2016/5/9/chartex" xmlns:cx4="http://schemas.microsoft.com/office/drawing/2016/5/10/chartex" xmlns:cx5="http://schemas.microsoft.com/office/drawing/2016/5/11/chartex" xmlns:cx6="http://schemas.microsoft.com/office/drawing/2016/5/12/chartex" xmlns:cx7="http://schemas.microsoft.com/office/drawing/2016/5/13/chartex" xmlns:cx8="http://schemas.microsoft.com/office/drawing/2016/5/14/chartex" xmlns:mc="http://schemas.openxmlformats.org/markup-compatibility/2006" xmlns:aink="http://schemas.microsoft.com/office/drawing/2016/ink" xmlns:am3d="http://schemas.microsoft.com/office/drawing/2017/model3d" xmlns:o="urn:schemas-microsoft-com:office:office" xmlns:oel="http://schemas.microsoft.com/office/2019/extlst" xmlns:r="http://schemas.openxmlformats.org/officeDocument/2006/relationships" xmlns:m="http://schemas.openxmlformats.org/officeDocument/2006/math" xmlns:v="urn:schemas-microsoft-com:vml" xmlns:wp14="http://schemas.microsoft.com/office/word/2010/wordprocessingDrawing" xmlns:wp="http://schemas.openxmlformats.org/drawingml/2006/wordprocessingDrawing" xmlns:w10="urn:schemas-microsoft-com:office:word" xmlns:w="http://schemas.openxmlformats.org/wordprocessingml/2006/main" xmlns:w14="http://schemas.microsoft.com/office/word/2010/wordml" xmlns:w15="http://schemas.microsoft.com/office/word/2012/wordml" xmlns:w16cex="http://schemas.microsoft.com/office/word/2018/wordml/cex" xmlns:w16cid="http://schemas.microsoft.com/office/word/2016/wordml/cid" xmlns:w16="http://schemas.microsoft.com/office/word/2018/wordml" xmlns:w16du="http://schemas.microsoft.com/office/word/2023/wordml/word16du" xmlns:w16sdtdh="http://schemas.microsoft.com/office/word/2020/wordml/sdtdatahash" xmlns:w16sdtfl="http://schemas.microsoft.com/office/word/2024/wordml/sdtformatlock" xmlns:w16se="http://schemas.microsoft.com/office/word/2015/wordml/symex" xmlns:wpg="http://schemas.microsoft.com/office/word/2010/wordprocessingGroup" xmlns:wpi="http://schemas.microsoft.com/office/word/2010/wordprocessingInk" xmlns:wne="http://schemas.microsoft.com/office/word/2006/wordml" xmlns:wps="http://schemas.microsoft.com/office/word/2010/wordprocessingShape" mc:Ignorable="w14 w15 w16se w16cid w16 w16cex w16sdtdh w16sdtfl w16du wp14">
+  <w:endnote w:type="separator" w:id="-1">
+    <w:p>
+      <w:pPr>
+        <w:spacing w:after="0" w:line="240" w:lineRule="auto"/>
+      </w:pPr>
+      <w:r>
+        <w:separator/>
+      </w:r>
+    </w:p>
+  </w:endnote>
+  <w:endnote w:type="continuationSeparator" w:id="0">
+    <w:p>
+      <w:pPr>
+        <w:spacing w:after="0" w:line="240" w:lineRule="auto"/>
+      </w:pPr>
+      <w:r>
+        <w:continuationSeparator/>
+      </w:r>
+    </w:p>
+  </w:endnote>
+</w:endnotes>
+</file>
+
+<file path=word/footnotes.xml><?xml version="1.0" encoding="utf-8"?>
+<w:footnotes xmlns:wpc="http://schemas.microsoft.com/office/word/2010/wordprocessingCanvas" xmlns:cx="http://schemas.microsoft.com/office/drawing/2014/chartex" xmlns:cx1="http://schemas.microsoft.com/office/drawing/2015/9/8/chartex" xmlns:cx2="http://schemas.microsoft.com/office/drawing/2015/10/21/chartex" xmlns:cx3="http://schemas.microsoft.com/office/drawing/2016/5/9/chartex" xmlns:cx4="http://schemas.microsoft.com/office/drawing/2016/5/10/chartex" xmlns:cx5="http://schemas.microsoft.com/office/drawing/2016/5/11/chartex" xmlns:cx6="http://schemas.microsoft.com/office/drawing/2016/5/12/chartex" xmlns:cx7="http://schemas.microsoft.com/office/drawing/2016/5/13/chartex" xmlns:cx8="http://schemas.microsoft.com/office/drawing/2016/5/14/chartex" xmlns:mc="http://schemas.openxmlformats.org/markup-compatibility/2006" xmlns:aink="http://schemas.microsoft.com/office/drawing/2016/ink" xmlns:am3d="http://schemas.microsoft.com/office/drawing/2017/model3d" xmlns:o="urn:schemas-microsoft-com:office:office" xmlns:oel="http://schemas.microsoft.com/office/2019/extlst" xmlns:r="http://schemas.openxmlformats.org/officeDocument/2006/relationships" xmlns:m="http://schemas.openxmlformats.org/officeDocument/2006/math" xmlns:v="urn:schemas-microsoft-com:vml" xmlns:wp14="http://schemas.microsoft.com/office/word/2010/wordprocessingDrawing" xmlns:wp="http://schemas.openxmlformats.org/drawingml/2006/wordprocessingDrawing" xmlns:w10="urn:schemas-microsoft-com:office:word" xmlns:w="http://schemas.openxmlformats.org/wordprocessingml/2006/main" xmlns:w14="http://schemas.microsoft.com/office/word/2010/wordml" xmlns:w15="http://schemas.microsoft.com/office/word/2012/wordml" xmlns:w16cex="http://schemas.microsoft.com/office/word/2018/wordml/cex" xmlns:w16cid="http://schemas.microsoft.com/office/word/2016/wordml/cid" xmlns:w16="http://schemas.microsoft.com/office/word/2018/wordml" xmlns:w16du="http://schemas.microsoft.com/office/word/2023/wordml/word16du" xmlns:w16sdtdh="http://schemas.microsoft.com/office/word/2020/wordml/sdtdatahash" xmlns:w16sdtfl="http://schemas.microsoft.com/office/word/2024/wordml/sdtformatlock" xmlns:w16se="http://schemas.microsoft.com/office/word/2015/wordml/symex" xmlns:wpg="http://schemas.microsoft.com/office/word/2010/wordprocessingGroup" xmlns:wpi="http://schemas.microsoft.com/office/word/2010/wordprocessingInk" xmlns:wne="http://schemas.microsoft.com/office/word/2006/wordml" xmlns:wps="http://schemas.microsoft.com/office/word/2010/wordprocessingShape" mc:Ignorable="w14 w15 w16se w16cid w16 w16cex w16sdtdh w16sdtfl w16du wp14">
+  <w:footnote w:type="separator" w:id="-1">
+    <w:p>
+      <w:pPr>
+        <w:spacing w:after="0" w:line="240" w:lineRule="auto"/>
+      </w:pPr>
+      <w:r>
+        <w:separator/>
+      </w:r>
+    </w:p>
+  </w:footnote>
+  <w:footnote w:type="continuationSeparator" w:id="0">
+    <w:p>
+      <w:pPr>
+        <w:spacing w:after="0" w:line="240" w:lineRule="auto"/>
+      </w:pPr>
+      <w:r>
+        <w:continuationSeparator/>
+      </w:r>
+    </w:p>
+  </w:footnote>
+</w:footnotes>
+</file>
+
+<file path=word/numbering.xml><?xml version="1.0" encoding="utf-8"?>
+<w:numbering xmlns:wpc="http://schemas.microsoft.com/office/word/2010/wordprocessingCanvas" xmlns:cx="http://schemas.microsoft.com/office/drawing/2014/chartex" xmlns:cx1="http://schemas.microsoft.com/office/drawing/2015/9/8/chartex" xmlns:cx2="http://schemas.microsoft.com/office/drawing/2015/10/21/chartex" xmlns:cx3="http://schemas.microsoft.com/office/drawing/2016/5/9/chartex" xmlns:cx4="http://schemas.microsoft.com/office/drawing/2016/5/10/chartex" xmlns:cx5="http://schemas.microsoft.com/office/drawing/2016/5/11/chartex" xmlns:cx6="http://schemas.microsoft.com/office/drawing/2016/5/12/chartex" xmlns:cx7="http://schemas.microsoft.com/office/drawing/2016/5/13/chartex" xmlns:cx8="http://schemas.microsoft.com/office/drawing/2016/5/14/chartex" xmlns:mc="http://schemas.openxmlformats.org/markup-compatibility/2006" xmlns:aink="http://schemas.microsoft.com/office/drawing/2016/ink" xmlns:am3d="http://schemas.microsoft.com/office/drawing/2017/model3d" xmlns:o="urn:schemas-microsoft-com:office:office" xmlns:oel="http://schemas.microsoft.com/office/2019/extlst" xmlns:r="http://schemas.openxmlformats.org/officeDocument/2006/relationships" xmlns:m="http://schemas.openxmlformats.org/officeDocument/2006/math" xmlns:v="urn:schemas-microsoft-com:vml" xmlns:wp14="http://schemas.microsoft.com/office/word/2010/wordprocessingDrawing" xmlns:wp="http://schemas.openxmlformats.org/drawingml/2006/wordprocessingDrawing" xmlns:w10="urn:schemas-microsoft-com:office:word" xmlns:w="http://schemas.openxmlformats.org/wordprocessingml/2006/main" xmlns:w14="http://schemas.microsoft.com/office/word/2010/wordml" xmlns:w15="http://schemas.microsoft.com/office/word/2012/wordml" xmlns:w16cex="http://schemas.microsoft.com/office/word/2018/wordml/cex" xmlns:w16cid="http://schemas.microsoft.com/office/word/2016/wordml/cid" xmlns:w16="http://schemas.microsoft.com/office/word/2018/wordml" xmlns:w16du="http://schemas.microsoft.com/office/word/2023/wordml/word16du" xmlns:w16sdtdh="http://schemas.microsoft.com/office/word/2020/wordml/sdtdatahash" xmlns:w16sdtfl="http://schemas.microsoft.com/office/word/2024/wordml/sdtformatlock" xmlns:w16se="http://schemas.microsoft.com/office/word/2015/wordml/symex" xmlns:wpg="http://schemas.microsoft.com/office/word/2010/wordprocessingGroup" xmlns:wpi="http://schemas.microsoft.com/office/word/2010/wordprocessingInk" xmlns:wne="http://schemas.microsoft.com/office/word/2006/wordml" xmlns:wps="http://schemas.microsoft.com/office/word/2010/wordprocessingShape" mc:Ignorable="w14 w15 w16se w16cid w16 w16cex w16sdtdh w16sdtfl w16du wp14">
+  <w:abstractNum w:abstractNumId="0" w15:restartNumberingAfterBreak="0">
+    <w:nsid w:val="477B0586"/>
+    <w:multiLevelType w:val="hybridMultilevel"/>
+    <w:tmpl w:val="A57C2546"/>
+    <w:lvl w:ilvl="0" w:tplc="4C09000F">
+      <w:start w:val="1"/>
+      <w:numFmt w:val="decimal"/>
+      <w:lvlText w:val="%1."/>
+      <w:lvlJc w:val="left"/>
+      <w:pPr>
+        <w:ind w:left="720" w:hanging="360"/>
+      </w:pPr>
+      <w:rPr>
+        <w:rFonts w:hint="default"/>
+      </w:rPr>
+    </w:lvl>
+    <w:lvl w:ilvl="1" w:tplc="4C090019" w:tentative="1">
+      <w:start w:val="1"/>
+      <w:numFmt w:val="lowerLetter"/>
+      <w:lvlText w:val="%2."/>
+      <w:lvlJc w:val="left"/>
+      <w:pPr>
+        <w:ind w:left="1440" w:hanging="360"/>
+      </w:pPr>
+    </w:lvl>
+    <w:lvl w:ilvl="2" w:tplc="4C09001B" w:tentative="1">
+      <w:start w:val="1"/>
+      <w:numFmt w:val="lowerRoman"/>
+      <w:lvlText w:val="%3."/>
+      <w:lvlJc w:val="right"/>
+      <w:pPr>
+        <w:ind w:left="2160" w:hanging="180"/>
+      </w:pPr>
+    </w:lvl>
+    <w:lvl w:ilvl="3" w:tplc="4C09000F" w:tentative="1">
+      <w:start w:val="1"/>
+      <w:numFmt w:val="decimal"/>
+      <w:lvlText w:val="%4."/>
+      <w:lvlJc w:val="left"/>
+      <w:pPr>
+        <w:ind w:left="2880" w:hanging="360"/>
+      </w:pPr>
+    </w:lvl>
+    <w:lvl w:ilvl="4" w:tplc="4C090019" w:tentative="1">
+      <w:start w:val="1"/>
+      <w:numFmt w:val="lowerLetter"/>
+      <w:lvlText w:val="%5."/>
+      <w:lvlJc w:val="left"/>
+      <w:pPr>
+        <w:ind w:left="3600" w:hanging="360"/>
+      </w:pPr>
+    </w:lvl>
+    <w:lvl w:ilvl="5" w:tplc="4C09001B" w:tentative="1">
+      <w:start w:val="1"/>
+      <w:numFmt w:val="lowerRoman"/>
+      <w:lvlText w:val="%6."/>
+      <w:lvlJc w:val="right"/>
+      <w:pPr>
+        <w:ind w:left="4320" w:hanging="180"/>
+      </w:pPr>
+    </w:lvl>
+    <w:lvl w:ilvl="6" w:tplc="4C09000F" w:tentative="1">
+      <w:start w:val="1"/>
+      <w:numFmt w:val="decimal"/>
+      <w:lvlText w:val="%7."/>
+      <w:lvlJc w:val="left"/>
+      <w:pPr>
+        <w:ind w:left="5040" w:hanging="360"/>
+      </w:pPr>
+    </w:lvl>
+    <w:lvl w:ilvl="7" w:tplc="4C090019" w:tentative="1">
+      <w:start w:val="1"/>
+      <w:numFmt w:val="lowerLetter"/>
+      <w:lvlText w:val="%8."/>
+      <w:lvlJc w:val="left"/>
+      <w:pPr>
+        <w:ind w:left="5760" w:hanging="360"/>
+      </w:pPr>
+    </w:lvl>
+    <w:lvl w:ilvl="8" w:tplc="4C09001B" w:tentative="1">
+      <w:start w:val="1"/>
+      <w:numFmt w:val="lowerRoman"/>
+      <w:lvlText w:val="%9."/>
+      <w:lvlJc w:val="right"/>
+      <w:pPr>
+        <w:ind w:left="6480" w:hanging="180"/>
+      </w:pPr>
+    </w:lvl>
+  </w:abstractNum>
+  <w:num w:numId="1" w16cid:durableId="7873142">
+    <w:abstractNumId w:val="0"/>
+  </w:num>
+</w:numbering>
 </file>
 
 <file path=word/styles.xml><?xml version="1.0" encoding="utf-8"?>
@@ -643,7 +1229,6 @@
   <w:style w:type="character" w:default="1" w:styleId="DefaultParagraphFont">
     <w:name w:val="Default Paragraph Font"/>
     <w:uiPriority w:val="1"/>
-    <w:semiHidden/>
     <w:unhideWhenUsed/>
   </w:style>
   <w:style w:type="table" w:default="1" w:styleId="TableNormal">
@@ -968,6 +1553,99 @@
       <w:smallCaps/>
       <w:color w:val="0F4761" w:themeColor="accent1" w:themeShade="BF"/>
       <w:spacing w:val="5"/>
+    </w:rPr>
+  </w:style>
+  <w:style w:type="paragraph" w:styleId="Header">
+    <w:name w:val="header"/>
+    <w:basedOn w:val="Normal"/>
+    <w:link w:val="HeaderChar"/>
+    <w:uiPriority w:val="99"/>
+    <w:unhideWhenUsed/>
+    <w:rsid w:val="005F4F68"/>
+    <w:pPr>
+      <w:tabs>
+        <w:tab w:val="center" w:pos="4513"/>
+        <w:tab w:val="right" w:pos="9026"/>
+      </w:tabs>
+      <w:spacing w:after="0" w:line="240" w:lineRule="auto"/>
+    </w:pPr>
+  </w:style>
+  <w:style w:type="character" w:customStyle="1" w:styleId="HeaderChar">
+    <w:name w:val="Header Char"/>
+    <w:basedOn w:val="DefaultParagraphFont"/>
+    <w:link w:val="Header"/>
+    <w:uiPriority w:val="99"/>
+    <w:rsid w:val="005F4F68"/>
+    <w:rPr>
+      <w:lang w:val="en-GB"/>
+    </w:rPr>
+  </w:style>
+  <w:style w:type="paragraph" w:styleId="Footer">
+    <w:name w:val="footer"/>
+    <w:basedOn w:val="Normal"/>
+    <w:link w:val="FooterChar"/>
+    <w:uiPriority w:val="99"/>
+    <w:unhideWhenUsed/>
+    <w:rsid w:val="005F4F68"/>
+    <w:pPr>
+      <w:tabs>
+        <w:tab w:val="center" w:pos="4513"/>
+        <w:tab w:val="right" w:pos="9026"/>
+      </w:tabs>
+      <w:spacing w:after="0" w:line="240" w:lineRule="auto"/>
+    </w:pPr>
+  </w:style>
+  <w:style w:type="character" w:customStyle="1" w:styleId="FooterChar">
+    <w:name w:val="Footer Char"/>
+    <w:basedOn w:val="DefaultParagraphFont"/>
+    <w:link w:val="Footer"/>
+    <w:uiPriority w:val="99"/>
+    <w:rsid w:val="005F4F68"/>
+    <w:rPr>
+      <w:lang w:val="en-GB"/>
+    </w:rPr>
+  </w:style>
+  <w:style w:type="paragraph" w:styleId="TOCHeading">
+    <w:name w:val="TOC Heading"/>
+    <w:basedOn w:val="Heading1"/>
+    <w:next w:val="Normal"/>
+    <w:uiPriority w:val="39"/>
+    <w:unhideWhenUsed/>
+    <w:qFormat/>
+    <w:rsid w:val="005F4F68"/>
+    <w:pPr>
+      <w:spacing w:before="240" w:after="0"/>
+      <w:outlineLvl w:val="9"/>
+    </w:pPr>
+    <w:rPr>
+      <w:kern w:val="0"/>
+      <w:sz w:val="32"/>
+      <w:szCs w:val="32"/>
+      <w:lang w:val="en-US"/>
+      <w14:ligatures w14:val="none"/>
+    </w:rPr>
+  </w:style>
+  <w:style w:type="paragraph" w:styleId="TOC1">
+    <w:name w:val="toc 1"/>
+    <w:basedOn w:val="Normal"/>
+    <w:next w:val="Normal"/>
+    <w:autoRedefine/>
+    <w:uiPriority w:val="39"/>
+    <w:unhideWhenUsed/>
+    <w:rsid w:val="00B12ECB"/>
+    <w:pPr>
+      <w:spacing w:after="100"/>
+    </w:pPr>
+  </w:style>
+  <w:style w:type="character" w:styleId="Hyperlink">
+    <w:name w:val="Hyperlink"/>
+    <w:basedOn w:val="DefaultParagraphFont"/>
+    <w:uiPriority w:val="99"/>
+    <w:unhideWhenUsed/>
+    <w:rsid w:val="00B12ECB"/>
+    <w:rPr>
+      <w:color w:val="467886" w:themeColor="hyperlink"/>
+      <w:u w:val="single"/>
     </w:rPr>
   </w:style>
 </w:styles>
@@ -1266,4 +1944,16 @@
     </a:ext>
   </a:extLst>
 </a:theme>
+</file>
+
+<file path=customXml/item1.xml><?xml version="1.0" encoding="utf-8"?>
+<b:Sources xmlns:b="http://schemas.openxmlformats.org/officeDocument/2006/bibliography" xmlns="http://schemas.openxmlformats.org/officeDocument/2006/bibliography" SelectedStyle="\IEEE2006OfficeOnline.xsl" StyleName="IEEE" Version="2006"/>
+</file>
+
+<file path=customXml/itemProps1.xml><?xml version="1.0" encoding="utf-8"?>
+<ds:datastoreItem xmlns:ds="http://schemas.openxmlformats.org/officeDocument/2006/customXml" ds:itemID="{3C7D1540-D986-4D18-A626-DB748FAC0544}">
+  <ds:schemaRefs>
+    <ds:schemaRef ds:uri="http://schemas.openxmlformats.org/officeDocument/2006/bibliography"/>
+  </ds:schemaRefs>
+</ds:datastoreItem>
 </file>
</xml_diff>